<commit_message>
#Last version doc architecture
</commit_message>
<xml_diff>
--- a/Architecture projet Transcription.docx
+++ b/Architecture projet Transcription.docx
@@ -19,7 +19,6 @@
         <w:t>Architecture projet Transcription</w:t>
       </w:r>
     </w:p>
-    <w:p/>
     <w:p/>
     <w:p>
       <w:pPr>
@@ -90,21 +89,68 @@
                               <w:pStyle w:val="Lgende"/>
                               <w:jc w:val="center"/>
                               <w:rPr>
+                                <w:rFonts w:ascii="Arial" w:hAnsi="Arial" w:cs="Arial"/>
                                 <w:noProof/>
+                                <w:sz w:val="24"/>
+                                <w:szCs w:val="24"/>
                               </w:rPr>
                             </w:pPr>
                             <w:r>
+                              <w:rPr>
+                                <w:rFonts w:ascii="Arial" w:hAnsi="Arial" w:cs="Arial"/>
+                                <w:sz w:val="24"/>
+                                <w:szCs w:val="24"/>
+                              </w:rPr>
                               <w:t xml:space="preserve">Figure </w:t>
                             </w:r>
-                            <w:fldSimple w:instr=" SEQ Figure \* ARABIC ">
-                              <w:r>
-                                <w:rPr>
-                                  <w:noProof/>
-                                </w:rPr>
-                                <w:t>1</w:t>
-                              </w:r>
-                            </w:fldSimple>
                             <w:r>
+                              <w:rPr>
+                                <w:rFonts w:ascii="Arial" w:hAnsi="Arial" w:cs="Arial"/>
+                                <w:sz w:val="24"/>
+                                <w:szCs w:val="24"/>
+                              </w:rPr>
+                              <w:fldChar w:fldCharType="begin"/>
+                            </w:r>
+                            <w:r>
+                              <w:rPr>
+                                <w:rFonts w:ascii="Arial" w:hAnsi="Arial" w:cs="Arial"/>
+                                <w:sz w:val="24"/>
+                                <w:szCs w:val="24"/>
+                              </w:rPr>
+                              <w:instrText xml:space="preserve"> SEQ Figure \* ARABIC </w:instrText>
+                            </w:r>
+                            <w:r>
+                              <w:rPr>
+                                <w:rFonts w:ascii="Arial" w:hAnsi="Arial" w:cs="Arial"/>
+                                <w:sz w:val="24"/>
+                                <w:szCs w:val="24"/>
+                              </w:rPr>
+                              <w:fldChar w:fldCharType="separate"/>
+                            </w:r>
+                            <w:r>
+                              <w:rPr>
+                                <w:rFonts w:ascii="Arial" w:hAnsi="Arial" w:cs="Arial"/>
+                                <w:noProof/>
+                                <w:sz w:val="24"/>
+                                <w:szCs w:val="24"/>
+                              </w:rPr>
+                              <w:t>1</w:t>
+                            </w:r>
+                            <w:r>
+                              <w:rPr>
+                                <w:rFonts w:ascii="Arial" w:hAnsi="Arial" w:cs="Arial"/>
+                                <w:noProof/>
+                                <w:sz w:val="24"/>
+                                <w:szCs w:val="24"/>
+                              </w:rPr>
+                              <w:fldChar w:fldCharType="end"/>
+                            </w:r>
+                            <w:r>
+                              <w:rPr>
+                                <w:rFonts w:ascii="Arial" w:hAnsi="Arial" w:cs="Arial"/>
+                                <w:sz w:val="24"/>
+                                <w:szCs w:val="24"/>
+                              </w:rPr>
                               <w:t xml:space="preserve"> : Diagramme de classes</w:t>
                             </w:r>
                           </w:p>
@@ -136,21 +182,68 @@
                         <w:pStyle w:val="Lgende"/>
                         <w:jc w:val="center"/>
                         <w:rPr>
+                          <w:rFonts w:ascii="Arial" w:hAnsi="Arial" w:cs="Arial"/>
                           <w:noProof/>
+                          <w:sz w:val="24"/>
+                          <w:szCs w:val="24"/>
                         </w:rPr>
                       </w:pPr>
                       <w:r>
+                        <w:rPr>
+                          <w:rFonts w:ascii="Arial" w:hAnsi="Arial" w:cs="Arial"/>
+                          <w:sz w:val="24"/>
+                          <w:szCs w:val="24"/>
+                        </w:rPr>
                         <w:t xml:space="preserve">Figure </w:t>
                       </w:r>
-                      <w:fldSimple w:instr=" SEQ Figure \* ARABIC ">
-                        <w:r>
-                          <w:rPr>
-                            <w:noProof/>
-                          </w:rPr>
-                          <w:t>1</w:t>
-                        </w:r>
-                      </w:fldSimple>
                       <w:r>
+                        <w:rPr>
+                          <w:rFonts w:ascii="Arial" w:hAnsi="Arial" w:cs="Arial"/>
+                          <w:sz w:val="24"/>
+                          <w:szCs w:val="24"/>
+                        </w:rPr>
+                        <w:fldChar w:fldCharType="begin"/>
+                      </w:r>
+                      <w:r>
+                        <w:rPr>
+                          <w:rFonts w:ascii="Arial" w:hAnsi="Arial" w:cs="Arial"/>
+                          <w:sz w:val="24"/>
+                          <w:szCs w:val="24"/>
+                        </w:rPr>
+                        <w:instrText xml:space="preserve"> SEQ Figure \* ARABIC </w:instrText>
+                      </w:r>
+                      <w:r>
+                        <w:rPr>
+                          <w:rFonts w:ascii="Arial" w:hAnsi="Arial" w:cs="Arial"/>
+                          <w:sz w:val="24"/>
+                          <w:szCs w:val="24"/>
+                        </w:rPr>
+                        <w:fldChar w:fldCharType="separate"/>
+                      </w:r>
+                      <w:r>
+                        <w:rPr>
+                          <w:rFonts w:ascii="Arial" w:hAnsi="Arial" w:cs="Arial"/>
+                          <w:noProof/>
+                          <w:sz w:val="24"/>
+                          <w:szCs w:val="24"/>
+                        </w:rPr>
+                        <w:t>1</w:t>
+                      </w:r>
+                      <w:r>
+                        <w:rPr>
+                          <w:rFonts w:ascii="Arial" w:hAnsi="Arial" w:cs="Arial"/>
+                          <w:noProof/>
+                          <w:sz w:val="24"/>
+                          <w:szCs w:val="24"/>
+                        </w:rPr>
+                        <w:fldChar w:fldCharType="end"/>
+                      </w:r>
+                      <w:r>
+                        <w:rPr>
+                          <w:rFonts w:ascii="Arial" w:hAnsi="Arial" w:cs="Arial"/>
+                          <w:sz w:val="24"/>
+                          <w:szCs w:val="24"/>
+                        </w:rPr>
                         <w:t xml:space="preserve"> : Diagramme de classes</w:t>
                       </w:r>
                     </w:p>
@@ -167,7 +260,7 @@
           <w:noProof/>
         </w:rPr>
         <w:drawing>
-          <wp:anchor distT="0" distB="0" distL="114300" distR="114300" simplePos="0" relativeHeight="251658240" behindDoc="1" locked="0" layoutInCell="1" allowOverlap="1" wp14:anchorId="429442BB" wp14:editId="20B0C1E3">
+          <wp:anchor distT="0" distB="0" distL="114300" distR="114300" simplePos="0" relativeHeight="251658240" behindDoc="1" locked="0" layoutInCell="1" allowOverlap="1" wp14:anchorId="429442BB" wp14:editId="703BA2E1">
             <wp:simplePos x="0" y="0"/>
             <wp:positionH relativeFrom="column">
               <wp:posOffset>0</wp:posOffset>
@@ -176,14 +269,14 @@
               <wp:posOffset>3810</wp:posOffset>
             </wp:positionV>
             <wp:extent cx="5760000" cy="5360400"/>
-            <wp:effectExtent l="0" t="0" r="6350" b="0"/>
+            <wp:effectExtent l="12700" t="12700" r="19050" b="12065"/>
             <wp:wrapTight wrapText="bothSides">
               <wp:wrapPolygon edited="0">
-                <wp:start x="0" y="0"/>
-                <wp:lineTo x="0" y="21546"/>
-                <wp:lineTo x="21576" y="21546"/>
-                <wp:lineTo x="21576" y="0"/>
-                <wp:lineTo x="0" y="0"/>
+                <wp:start x="-48" y="-51"/>
+                <wp:lineTo x="-48" y="21597"/>
+                <wp:lineTo x="21624" y="21597"/>
+                <wp:lineTo x="21624" y="-51"/>
+                <wp:lineTo x="-48" y="-51"/>
               </wp:wrapPolygon>
             </wp:wrapTight>
             <wp:docPr id="2117520483" name="Image 1" descr="Une image contenant texte, capture d’écran, diagramme, conception&#10;&#10;Le contenu généré par l’IA peut être incorrect."/>
@@ -198,7 +291,7 @@
                     <pic:cNvPicPr/>
                   </pic:nvPicPr>
                   <pic:blipFill>
-                    <a:blip r:embed="rId5">
+                    <a:blip r:embed="rId7">
                       <a:extLst>
                         <a:ext uri="{28A0092B-C50C-407E-A947-70E740481C1C}">
                           <a14:useLocalDpi xmlns:a14="http://schemas.microsoft.com/office/drawing/2010/main" val="0"/>
@@ -217,6 +310,11 @@
                     <a:prstGeom prst="rect">
                       <a:avLst/>
                     </a:prstGeom>
+                    <a:ln>
+                      <a:solidFill>
+                        <a:schemeClr val="accent1"/>
+                      </a:solidFill>
+                    </a:ln>
                   </pic:spPr>
                 </pic:pic>
               </a:graphicData>
@@ -318,21 +416,68 @@
                               <w:pStyle w:val="Lgende"/>
                               <w:jc w:val="center"/>
                               <w:rPr>
+                                <w:rFonts w:ascii="Arial" w:hAnsi="Arial" w:cs="Arial"/>
                                 <w:noProof/>
+                                <w:sz w:val="24"/>
+                                <w:szCs w:val="24"/>
                               </w:rPr>
                             </w:pPr>
                             <w:r>
+                              <w:rPr>
+                                <w:rFonts w:ascii="Arial" w:hAnsi="Arial" w:cs="Arial"/>
+                                <w:sz w:val="24"/>
+                                <w:szCs w:val="24"/>
+                              </w:rPr>
                               <w:t xml:space="preserve">Figure </w:t>
                             </w:r>
-                            <w:fldSimple w:instr=" SEQ Figure \* ARABIC ">
-                              <w:r>
-                                <w:rPr>
-                                  <w:noProof/>
-                                </w:rPr>
-                                <w:t>2</w:t>
-                              </w:r>
-                            </w:fldSimple>
                             <w:r>
+                              <w:rPr>
+                                <w:rFonts w:ascii="Arial" w:hAnsi="Arial" w:cs="Arial"/>
+                                <w:sz w:val="24"/>
+                                <w:szCs w:val="24"/>
+                              </w:rPr>
+                              <w:fldChar w:fldCharType="begin"/>
+                            </w:r>
+                            <w:r>
+                              <w:rPr>
+                                <w:rFonts w:ascii="Arial" w:hAnsi="Arial" w:cs="Arial"/>
+                                <w:sz w:val="24"/>
+                                <w:szCs w:val="24"/>
+                              </w:rPr>
+                              <w:instrText xml:space="preserve"> SEQ Figure \* ARABIC </w:instrText>
+                            </w:r>
+                            <w:r>
+                              <w:rPr>
+                                <w:rFonts w:ascii="Arial" w:hAnsi="Arial" w:cs="Arial"/>
+                                <w:sz w:val="24"/>
+                                <w:szCs w:val="24"/>
+                              </w:rPr>
+                              <w:fldChar w:fldCharType="separate"/>
+                            </w:r>
+                            <w:r>
+                              <w:rPr>
+                                <w:rFonts w:ascii="Arial" w:hAnsi="Arial" w:cs="Arial"/>
+                                <w:noProof/>
+                                <w:sz w:val="24"/>
+                                <w:szCs w:val="24"/>
+                              </w:rPr>
+                              <w:t>2</w:t>
+                            </w:r>
+                            <w:r>
+                              <w:rPr>
+                                <w:rFonts w:ascii="Arial" w:hAnsi="Arial" w:cs="Arial"/>
+                                <w:noProof/>
+                                <w:sz w:val="24"/>
+                                <w:szCs w:val="24"/>
+                              </w:rPr>
+                              <w:fldChar w:fldCharType="end"/>
+                            </w:r>
+                            <w:r>
+                              <w:rPr>
+                                <w:rFonts w:ascii="Arial" w:hAnsi="Arial" w:cs="Arial"/>
+                                <w:sz w:val="24"/>
+                                <w:szCs w:val="24"/>
+                              </w:rPr>
                               <w:t xml:space="preserve"> : Schéma d'architecture générale Micro-services</w:t>
                             </w:r>
                           </w:p>
@@ -360,21 +505,68 @@
                         <w:pStyle w:val="Lgende"/>
                         <w:jc w:val="center"/>
                         <w:rPr>
+                          <w:rFonts w:ascii="Arial" w:hAnsi="Arial" w:cs="Arial"/>
                           <w:noProof/>
+                          <w:sz w:val="24"/>
+                          <w:szCs w:val="24"/>
                         </w:rPr>
                       </w:pPr>
                       <w:r>
+                        <w:rPr>
+                          <w:rFonts w:ascii="Arial" w:hAnsi="Arial" w:cs="Arial"/>
+                          <w:sz w:val="24"/>
+                          <w:szCs w:val="24"/>
+                        </w:rPr>
                         <w:t xml:space="preserve">Figure </w:t>
                       </w:r>
-                      <w:fldSimple w:instr=" SEQ Figure \* ARABIC ">
-                        <w:r>
-                          <w:rPr>
-                            <w:noProof/>
-                          </w:rPr>
-                          <w:t>2</w:t>
-                        </w:r>
-                      </w:fldSimple>
                       <w:r>
+                        <w:rPr>
+                          <w:rFonts w:ascii="Arial" w:hAnsi="Arial" w:cs="Arial"/>
+                          <w:sz w:val="24"/>
+                          <w:szCs w:val="24"/>
+                        </w:rPr>
+                        <w:fldChar w:fldCharType="begin"/>
+                      </w:r>
+                      <w:r>
+                        <w:rPr>
+                          <w:rFonts w:ascii="Arial" w:hAnsi="Arial" w:cs="Arial"/>
+                          <w:sz w:val="24"/>
+                          <w:szCs w:val="24"/>
+                        </w:rPr>
+                        <w:instrText xml:space="preserve"> SEQ Figure \* ARABIC </w:instrText>
+                      </w:r>
+                      <w:r>
+                        <w:rPr>
+                          <w:rFonts w:ascii="Arial" w:hAnsi="Arial" w:cs="Arial"/>
+                          <w:sz w:val="24"/>
+                          <w:szCs w:val="24"/>
+                        </w:rPr>
+                        <w:fldChar w:fldCharType="separate"/>
+                      </w:r>
+                      <w:r>
+                        <w:rPr>
+                          <w:rFonts w:ascii="Arial" w:hAnsi="Arial" w:cs="Arial"/>
+                          <w:noProof/>
+                          <w:sz w:val="24"/>
+                          <w:szCs w:val="24"/>
+                        </w:rPr>
+                        <w:t>2</w:t>
+                      </w:r>
+                      <w:r>
+                        <w:rPr>
+                          <w:rFonts w:ascii="Arial" w:hAnsi="Arial" w:cs="Arial"/>
+                          <w:noProof/>
+                          <w:sz w:val="24"/>
+                          <w:szCs w:val="24"/>
+                        </w:rPr>
+                        <w:fldChar w:fldCharType="end"/>
+                      </w:r>
+                      <w:r>
+                        <w:rPr>
+                          <w:rFonts w:ascii="Arial" w:hAnsi="Arial" w:cs="Arial"/>
+                          <w:sz w:val="24"/>
+                          <w:szCs w:val="24"/>
+                        </w:rPr>
                         <w:t xml:space="preserve"> : Schéma d'architecture générale Micro-services</w:t>
                       </w:r>
                     </w:p>
@@ -422,7 +614,7 @@
                     <pic:cNvPicPr/>
                   </pic:nvPicPr>
                   <pic:blipFill>
-                    <a:blip r:embed="rId6">
+                    <a:blip r:embed="rId8">
                       <a:extLst>
                         <a:ext uri="{28A0092B-C50C-407E-A947-70E740481C1C}">
                           <a14:useLocalDpi xmlns:a14="http://schemas.microsoft.com/office/drawing/2010/main" val="0"/>
@@ -473,7 +665,6 @@
         <w:t xml:space="preserve">Découpage en micro-services </w:t>
       </w:r>
     </w:p>
-    <w:p/>
     <w:p>
       <w:r>
         <w:t xml:space="preserve">Ce projet a été défini comme un projet </w:t>
@@ -576,84 +767,284 @@
       <w:r>
         <w:t xml:space="preserve">/BDD. </w:t>
       </w:r>
-      <w:r>
+    </w:p>
+    <w:p>
+      <w:pPr>
+        <w:rPr>
+          <w:u w:val="single"/>
+        </w:rPr>
+      </w:pPr>
+      <w:r>
+        <w:rPr>
+          <w:u w:val="single"/>
+        </w:rPr>
+        <w:br w:type="page"/>
+      </w:r>
+      <w:r>
+        <w:rPr>
+          <w:u w:val="single"/>
+        </w:rPr>
+        <w:lastRenderedPageBreak/>
+        <w:t>Découpage en couches</w:t>
+      </w:r>
+      <w:r>
+        <w:rPr>
+          <w:u w:val="single"/>
+        </w:rPr>
+        <w:t xml:space="preserve"> de </w:t>
+      </w:r>
+      <w:proofErr w:type="gramStart"/>
+      <w:r>
+        <w:rPr>
+          <w:u w:val="single"/>
+        </w:rPr>
+        <w:t>meeting</w:t>
+      </w:r>
+      <w:proofErr w:type="gramEnd"/>
+      <w:r>
+        <w:rPr>
+          <w:u w:val="single"/>
+        </w:rPr>
+        <w:t xml:space="preserve">-service </w:t>
+      </w:r>
+      <w:r>
+        <w:rPr>
+          <w:u w:val="single"/>
+        </w:rPr>
+        <w:t>:</w:t>
+      </w:r>
+      <w:r>
+        <w:rPr>
+          <w:noProof/>
+          <w:u w:val="single"/>
+        </w:rPr>
+        <w:t xml:space="preserve"> </w:t>
+      </w:r>
+    </w:p>
+    <w:p>
+      <w:pPr>
+        <w:keepNext/>
+        <w:ind w:left="720"/>
+      </w:pPr>
+      <w:r>
+        <w:rPr>
+          <w:noProof/>
+          <w:u w:val="single"/>
+        </w:rPr>
+        <w:drawing>
+          <wp:inline distT="0" distB="0" distL="0" distR="0" wp14:anchorId="35D2A501" wp14:editId="0B810E2D">
+            <wp:extent cx="3037840" cy="6268996"/>
+            <wp:effectExtent l="0" t="0" r="0" b="0"/>
+            <wp:docPr id="440023798" name="Image 7" descr="Une image contenant texte, capture d’écran, reçu, Police&#10;&#10;Le contenu généré par l’IA peut être incorrect."/>
+            <wp:cNvGraphicFramePr>
+              <a:graphicFrameLocks xmlns:a="http://schemas.openxmlformats.org/drawingml/2006/main" noChangeAspect="1"/>
+            </wp:cNvGraphicFramePr>
+            <a:graphic xmlns:a="http://schemas.openxmlformats.org/drawingml/2006/main">
+              <a:graphicData uri="http://schemas.openxmlformats.org/drawingml/2006/picture">
+                <pic:pic xmlns:pic="http://schemas.openxmlformats.org/drawingml/2006/picture">
+                  <pic:nvPicPr>
+                    <pic:cNvPr id="440023798" name="Image 7" descr="Une image contenant texte, capture d’écran, reçu, Police&#10;&#10;Le contenu généré par l’IA peut être incorrect."/>
+                    <pic:cNvPicPr/>
+                  </pic:nvPicPr>
+                  <pic:blipFill>
+                    <a:blip r:embed="rId9">
+                      <a:extLst>
+                        <a:ext uri="{28A0092B-C50C-407E-A947-70E740481C1C}">
+                          <a14:useLocalDpi xmlns:a14="http://schemas.microsoft.com/office/drawing/2010/main" val="0"/>
+                        </a:ext>
+                      </a:extLst>
+                    </a:blip>
+                    <a:stretch>
+                      <a:fillRect/>
+                    </a:stretch>
+                  </pic:blipFill>
+                  <pic:spPr>
+                    <a:xfrm>
+                      <a:off x="0" y="0"/>
+                      <a:ext cx="3037840" cy="6268996"/>
+                    </a:xfrm>
+                    <a:prstGeom prst="rect">
+                      <a:avLst/>
+                    </a:prstGeom>
+                  </pic:spPr>
+                </pic:pic>
+              </a:graphicData>
+            </a:graphic>
+          </wp:inline>
+        </w:drawing>
+      </w:r>
+    </w:p>
+    <w:p>
+      <w:pPr>
+        <w:pStyle w:val="Lgende"/>
+        <w:rPr>
+          <w:rFonts w:ascii="Arial" w:hAnsi="Arial" w:cs="Arial"/>
+          <w:sz w:val="24"/>
+          <w:szCs w:val="24"/>
+          <w:u w:val="single"/>
+        </w:rPr>
+      </w:pPr>
+      <w:r>
+        <w:rPr>
+          <w:rFonts w:ascii="Arial" w:hAnsi="Arial" w:cs="Arial"/>
+          <w:sz w:val="24"/>
+          <w:szCs w:val="24"/>
+        </w:rPr>
+        <w:t xml:space="preserve">Figure </w:t>
+      </w:r>
+      <w:r>
+        <w:rPr>
+          <w:rFonts w:ascii="Arial" w:hAnsi="Arial" w:cs="Arial"/>
+          <w:sz w:val="24"/>
+          <w:szCs w:val="24"/>
+        </w:rPr>
+        <w:fldChar w:fldCharType="begin"/>
+      </w:r>
+      <w:r>
+        <w:rPr>
+          <w:rFonts w:ascii="Arial" w:hAnsi="Arial" w:cs="Arial"/>
+          <w:sz w:val="24"/>
+          <w:szCs w:val="24"/>
+        </w:rPr>
+        <w:instrText xml:space="preserve"> SEQ Figure \* ARABIC </w:instrText>
+      </w:r>
+      <w:r>
+        <w:rPr>
+          <w:rFonts w:ascii="Arial" w:hAnsi="Arial" w:cs="Arial"/>
+          <w:sz w:val="24"/>
+          <w:szCs w:val="24"/>
+        </w:rPr>
+        <w:fldChar w:fldCharType="separate"/>
+      </w:r>
+      <w:r>
+        <w:rPr>
+          <w:rFonts w:ascii="Arial" w:hAnsi="Arial" w:cs="Arial"/>
+          <w:noProof/>
+          <w:sz w:val="24"/>
+          <w:szCs w:val="24"/>
+        </w:rPr>
+        <w:t>3</w:t>
+      </w:r>
+      <w:r>
+        <w:rPr>
+          <w:rFonts w:ascii="Arial" w:hAnsi="Arial" w:cs="Arial"/>
+          <w:sz w:val="24"/>
+          <w:szCs w:val="24"/>
+        </w:rPr>
+        <w:fldChar w:fldCharType="end"/>
+      </w:r>
+      <w:r>
+        <w:rPr>
+          <w:rFonts w:ascii="Arial" w:hAnsi="Arial" w:cs="Arial"/>
+          <w:sz w:val="24"/>
+          <w:szCs w:val="24"/>
+        </w:rPr>
+        <w:t xml:space="preserve"> : Diagramme de couches </w:t>
+      </w:r>
+      <w:proofErr w:type="gramStart"/>
+      <w:r>
+        <w:rPr>
+          <w:rFonts w:ascii="Arial" w:hAnsi="Arial" w:cs="Arial"/>
+          <w:sz w:val="24"/>
+          <w:szCs w:val="24"/>
+        </w:rPr>
+        <w:t>meeting</w:t>
+      </w:r>
+      <w:proofErr w:type="gramEnd"/>
+      <w:r>
+        <w:rPr>
+          <w:rFonts w:ascii="Arial" w:hAnsi="Arial" w:cs="Arial"/>
+          <w:sz w:val="24"/>
+          <w:szCs w:val="24"/>
+        </w:rPr>
+        <w:t>-service</w:t>
+      </w:r>
+    </w:p>
+    <w:p>
+      <w:pPr>
+        <w:ind w:left="720"/>
+        <w:rPr>
+          <w:u w:val="single"/>
+        </w:rPr>
+      </w:pPr>
+    </w:p>
+    <w:p>
+      <w:pPr>
+        <w:ind w:firstLine="708"/>
+        <w:rPr>
+          <w:u w:val="single"/>
+        </w:rPr>
+      </w:pPr>
+    </w:p>
+    <w:p>
+      <w:pPr>
+        <w:ind w:firstLine="708"/>
+        <w:rPr>
+          <w:u w:val="single"/>
+        </w:rPr>
+      </w:pPr>
+    </w:p>
+    <w:p>
+      <w:pPr>
+        <w:ind w:firstLine="708"/>
+        <w:rPr>
+          <w:u w:val="single"/>
+        </w:rPr>
+      </w:pPr>
+    </w:p>
+    <w:p>
+      <w:pPr>
+        <w:ind w:firstLine="708"/>
+        <w:rPr>
+          <w:u w:val="single"/>
+        </w:rPr>
+      </w:pPr>
+    </w:p>
+    <w:p>
+      <w:pPr>
+        <w:ind w:firstLine="708"/>
+        <w:rPr>
+          <w:u w:val="single"/>
+        </w:rPr>
+      </w:pPr>
+    </w:p>
+    <w:p>
+      <w:pPr>
+        <w:ind w:firstLine="708"/>
+        <w:rPr>
+          <w:u w:val="single"/>
+        </w:rPr>
+      </w:pPr>
+    </w:p>
+    <w:p>
+      <w:pPr>
+        <w:ind w:firstLine="708"/>
         <w:rPr>
           <w:b/>
           <w:bCs/>
           <w:color w:val="EE0000"/>
         </w:rPr>
-        <w:t>AUTRE CHOSE A RAJOUTER ?</w:t>
-      </w:r>
-    </w:p>
-    <w:p>
-      <w:pPr>
-        <w:ind w:left="720"/>
+      </w:pPr>
+      <w:r>
         <w:rPr>
           <w:u w:val="single"/>
         </w:rPr>
-      </w:pPr>
+        <w:t>API</w:t>
+      </w:r>
       <w:r>
         <w:rPr>
           <w:u w:val="single"/>
         </w:rPr>
-        <w:t>Découpage en couches</w:t>
-      </w:r>
-      <w:r>
-        <w:rPr>
-          <w:u w:val="single"/>
-        </w:rPr>
-        <w:t> :</w:t>
-      </w:r>
-    </w:p>
-    <w:p>
-      <w:pPr>
-        <w:ind w:left="720"/>
-        <w:rPr>
-          <w:u w:val="single"/>
-        </w:rPr>
-      </w:pPr>
-    </w:p>
-    <w:p>
-      <w:pPr>
-        <w:ind w:left="720"/>
-        <w:rPr>
-          <w:u w:val="single"/>
-        </w:rPr>
-      </w:pPr>
-    </w:p>
-    <w:p>
-      <w:pPr>
+        <w:t>s</w:t>
+      </w:r>
+      <w:r>
+        <w:t xml:space="preserve"> : </w:t>
+      </w:r>
+    </w:p>
+    <w:p>
+      <w:pPr>
+        <w:keepNext/>
         <w:ind w:firstLine="708"/>
-        <w:rPr>
-          <w:b/>
-          <w:bCs/>
-          <w:color w:val="EE0000"/>
-        </w:rPr>
-      </w:pPr>
-      <w:r>
-        <w:rPr>
-          <w:u w:val="single"/>
-        </w:rPr>
-        <w:t>API</w:t>
-      </w:r>
-      <w:r>
-        <w:rPr>
-          <w:u w:val="single"/>
-        </w:rPr>
-        <w:t>s</w:t>
-      </w:r>
-      <w:r>
-        <w:t xml:space="preserve"> : </w:t>
-      </w:r>
-    </w:p>
-    <w:p>
-      <w:pPr>
-        <w:ind w:firstLine="708"/>
-        <w:rPr>
-          <w:b/>
-          <w:bCs/>
-          <w:color w:val="EE0000"/>
-        </w:rPr>
       </w:pPr>
       <w:r>
         <w:rPr>
@@ -678,7 +1069,7 @@
                     <pic:cNvPicPr/>
                   </pic:nvPicPr>
                   <pic:blipFill>
-                    <a:blip r:embed="rId7">
+                    <a:blip r:embed="rId10">
                       <a:extLst>
                         <a:ext uri="{28A0092B-C50C-407E-A947-70E740481C1C}">
                           <a14:useLocalDpi xmlns:a14="http://schemas.microsoft.com/office/drawing/2010/main" val="0"/>
@@ -707,6 +1098,95 @@
     </w:p>
     <w:p>
       <w:pPr>
+        <w:pStyle w:val="Lgende"/>
+        <w:jc w:val="center"/>
+        <w:rPr>
+          <w:rFonts w:ascii="Arial" w:hAnsi="Arial" w:cs="Arial"/>
+          <w:b/>
+          <w:bCs/>
+          <w:color w:val="EE0000"/>
+          <w:sz w:val="24"/>
+          <w:szCs w:val="24"/>
+        </w:rPr>
+      </w:pPr>
+      <w:r>
+        <w:rPr>
+          <w:rFonts w:ascii="Arial" w:hAnsi="Arial" w:cs="Arial"/>
+          <w:sz w:val="24"/>
+          <w:szCs w:val="24"/>
+        </w:rPr>
+        <w:t xml:space="preserve">Figure </w:t>
+      </w:r>
+      <w:r>
+        <w:rPr>
+          <w:rFonts w:ascii="Arial" w:hAnsi="Arial" w:cs="Arial"/>
+          <w:sz w:val="24"/>
+          <w:szCs w:val="24"/>
+        </w:rPr>
+        <w:fldChar w:fldCharType="begin"/>
+      </w:r>
+      <w:r>
+        <w:rPr>
+          <w:rFonts w:ascii="Arial" w:hAnsi="Arial" w:cs="Arial"/>
+          <w:sz w:val="24"/>
+          <w:szCs w:val="24"/>
+        </w:rPr>
+        <w:instrText xml:space="preserve"> SEQ Figure \* ARABIC </w:instrText>
+      </w:r>
+      <w:r>
+        <w:rPr>
+          <w:rFonts w:ascii="Arial" w:hAnsi="Arial" w:cs="Arial"/>
+          <w:sz w:val="24"/>
+          <w:szCs w:val="24"/>
+        </w:rPr>
+        <w:fldChar w:fldCharType="separate"/>
+      </w:r>
+      <w:r>
+        <w:rPr>
+          <w:rFonts w:ascii="Arial" w:hAnsi="Arial" w:cs="Arial"/>
+          <w:noProof/>
+          <w:sz w:val="24"/>
+          <w:szCs w:val="24"/>
+        </w:rPr>
+        <w:t>4</w:t>
+      </w:r>
+      <w:r>
+        <w:rPr>
+          <w:rFonts w:ascii="Arial" w:hAnsi="Arial" w:cs="Arial"/>
+          <w:sz w:val="24"/>
+          <w:szCs w:val="24"/>
+        </w:rPr>
+        <w:fldChar w:fldCharType="end"/>
+      </w:r>
+      <w:r>
+        <w:rPr>
+          <w:rFonts w:ascii="Arial" w:hAnsi="Arial" w:cs="Arial"/>
+          <w:sz w:val="24"/>
+          <w:szCs w:val="24"/>
+        </w:rPr>
+        <w:t xml:space="preserve"> : Schéma des API </w:t>
+      </w:r>
+      <w:proofErr w:type="gramStart"/>
+      <w:r>
+        <w:rPr>
+          <w:rFonts w:ascii="Arial" w:hAnsi="Arial" w:cs="Arial"/>
+          <w:sz w:val="24"/>
+          <w:szCs w:val="24"/>
+        </w:rPr>
+        <w:t>meeting</w:t>
+      </w:r>
+      <w:proofErr w:type="gramEnd"/>
+      <w:r>
+        <w:rPr>
+          <w:rFonts w:ascii="Arial" w:hAnsi="Arial" w:cs="Arial"/>
+          <w:sz w:val="24"/>
+          <w:szCs w:val="24"/>
+        </w:rPr>
+        <w:t>-service</w:t>
+      </w:r>
+    </w:p>
+    <w:p>
+      <w:pPr>
         <w:ind w:left="720"/>
       </w:pPr>
     </w:p>
@@ -831,7 +1311,11 @@
       </w:r>
       <w:proofErr w:type="spellEnd"/>
       <w:r>
-        <w:t xml:space="preserve"> a été mis en place pour la gestion des requêtes Front/Back et Back/BDD. Pour la </w:t>
+        <w:t xml:space="preserve"> a été mis en place pour la gestion des requêtes Front/Back et </w:t>
+      </w:r>
+      <w:r>
+        <w:lastRenderedPageBreak/>
+        <w:t xml:space="preserve">Back/BDD. Pour la </w:t>
       </w:r>
       <w:proofErr w:type="spellStart"/>
       <w:r>
@@ -889,24 +1373,135 @@
         <w:rPr>
           <w:u w:val="single"/>
         </w:rPr>
-        <w:t xml:space="preserve"> : </w:t>
-      </w:r>
-      <w:r>
-        <w:rPr>
-          <w:b/>
-          <w:bCs/>
-          <w:color w:val="EE0000"/>
-        </w:rPr>
-        <w:t>A AJOUTER</w:t>
-      </w:r>
-    </w:p>
-    <w:p>
-      <w:pPr>
+        <w:t xml:space="preserve"> de transcription-service </w:t>
+      </w:r>
+      <w:r>
+        <w:rPr>
+          <w:u w:val="single"/>
+        </w:rPr>
+        <w:t xml:space="preserve">: </w:t>
+      </w:r>
+    </w:p>
+    <w:p>
+      <w:pPr>
+        <w:keepNext/>
         <w:ind w:left="708"/>
-        <w:rPr>
+      </w:pPr>
+      <w:r>
+        <w:rPr>
+          <w:noProof/>
           <w:u w:val="single"/>
         </w:rPr>
-      </w:pPr>
+        <w:drawing>
+          <wp:inline distT="0" distB="0" distL="0" distR="0" wp14:anchorId="620351C6" wp14:editId="24B9A203">
+            <wp:extent cx="2861696" cy="5905500"/>
+            <wp:effectExtent l="0" t="0" r="0" b="0"/>
+            <wp:docPr id="331169521" name="Image 8" descr="Une image contenant texte, capture d’écran, reçu, ligne&#10;&#10;Le contenu généré par l’IA peut être incorrect."/>
+            <wp:cNvGraphicFramePr>
+              <a:graphicFrameLocks xmlns:a="http://schemas.openxmlformats.org/drawingml/2006/main" noChangeAspect="1"/>
+            </wp:cNvGraphicFramePr>
+            <a:graphic xmlns:a="http://schemas.openxmlformats.org/drawingml/2006/main">
+              <a:graphicData uri="http://schemas.openxmlformats.org/drawingml/2006/picture">
+                <pic:pic xmlns:pic="http://schemas.openxmlformats.org/drawingml/2006/picture">
+                  <pic:nvPicPr>
+                    <pic:cNvPr id="331169521" name="Image 8" descr="Une image contenant texte, capture d’écran, reçu, ligne&#10;&#10;Le contenu généré par l’IA peut être incorrect."/>
+                    <pic:cNvPicPr/>
+                  </pic:nvPicPr>
+                  <pic:blipFill>
+                    <a:blip r:embed="rId11">
+                      <a:extLst>
+                        <a:ext uri="{28A0092B-C50C-407E-A947-70E740481C1C}">
+                          <a14:useLocalDpi xmlns:a14="http://schemas.microsoft.com/office/drawing/2010/main" val="0"/>
+                        </a:ext>
+                      </a:extLst>
+                    </a:blip>
+                    <a:stretch>
+                      <a:fillRect/>
+                    </a:stretch>
+                  </pic:blipFill>
+                  <pic:spPr>
+                    <a:xfrm>
+                      <a:off x="0" y="0"/>
+                      <a:ext cx="2898246" cy="5980926"/>
+                    </a:xfrm>
+                    <a:prstGeom prst="rect">
+                      <a:avLst/>
+                    </a:prstGeom>
+                  </pic:spPr>
+                </pic:pic>
+              </a:graphicData>
+            </a:graphic>
+          </wp:inline>
+        </w:drawing>
+      </w:r>
+    </w:p>
+    <w:p>
+      <w:pPr>
+        <w:pStyle w:val="Lgende"/>
+        <w:rPr>
+          <w:rFonts w:ascii="Arial" w:hAnsi="Arial" w:cs="Arial"/>
+          <w:sz w:val="24"/>
+          <w:szCs w:val="24"/>
+          <w:u w:val="single"/>
+        </w:rPr>
+      </w:pPr>
+      <w:r>
+        <w:rPr>
+          <w:rFonts w:ascii="Arial" w:hAnsi="Arial" w:cs="Arial"/>
+          <w:sz w:val="24"/>
+          <w:szCs w:val="24"/>
+        </w:rPr>
+        <w:t xml:space="preserve">Figure </w:t>
+      </w:r>
+      <w:r>
+        <w:rPr>
+          <w:rFonts w:ascii="Arial" w:hAnsi="Arial" w:cs="Arial"/>
+          <w:sz w:val="24"/>
+          <w:szCs w:val="24"/>
+        </w:rPr>
+        <w:fldChar w:fldCharType="begin"/>
+      </w:r>
+      <w:r>
+        <w:rPr>
+          <w:rFonts w:ascii="Arial" w:hAnsi="Arial" w:cs="Arial"/>
+          <w:sz w:val="24"/>
+          <w:szCs w:val="24"/>
+        </w:rPr>
+        <w:instrText xml:space="preserve"> SEQ Figure \* ARABIC </w:instrText>
+      </w:r>
+      <w:r>
+        <w:rPr>
+          <w:rFonts w:ascii="Arial" w:hAnsi="Arial" w:cs="Arial"/>
+          <w:sz w:val="24"/>
+          <w:szCs w:val="24"/>
+        </w:rPr>
+        <w:fldChar w:fldCharType="separate"/>
+      </w:r>
+      <w:r>
+        <w:rPr>
+          <w:rFonts w:ascii="Arial" w:hAnsi="Arial" w:cs="Arial"/>
+          <w:noProof/>
+          <w:sz w:val="24"/>
+          <w:szCs w:val="24"/>
+        </w:rPr>
+        <w:t>5</w:t>
+      </w:r>
+      <w:r>
+        <w:rPr>
+          <w:rFonts w:ascii="Arial" w:hAnsi="Arial" w:cs="Arial"/>
+          <w:sz w:val="24"/>
+          <w:szCs w:val="24"/>
+        </w:rPr>
+        <w:fldChar w:fldCharType="end"/>
+      </w:r>
+      <w:r>
+        <w:rPr>
+          <w:rFonts w:ascii="Arial" w:hAnsi="Arial" w:cs="Arial"/>
+          <w:sz w:val="24"/>
+          <w:szCs w:val="24"/>
+        </w:rPr>
+        <w:t xml:space="preserve"> : Diagramme de couches transcription-service</w:t>
+      </w:r>
     </w:p>
     <w:p>
       <w:pPr>
@@ -918,8 +1513,244 @@
     </w:p>
     <w:p>
       <w:pPr>
+        <w:rPr>
+          <w:u w:val="single"/>
+        </w:rPr>
+      </w:pPr>
+      <w:r>
+        <w:rPr>
+          <w:u w:val="single"/>
+        </w:rPr>
+        <w:br w:type="page"/>
+      </w:r>
+    </w:p>
+    <w:p>
+      <w:pPr>
         <w:ind w:left="708"/>
       </w:pPr>
+      <w:r>
+        <w:rPr>
+          <w:noProof/>
+        </w:rPr>
+        <w:lastRenderedPageBreak/>
+        <mc:AlternateContent>
+          <mc:Choice Requires="wps">
+            <w:drawing>
+              <wp:anchor distT="0" distB="0" distL="114300" distR="114300" simplePos="0" relativeHeight="251667456" behindDoc="1" locked="0" layoutInCell="1" allowOverlap="1" wp14:anchorId="4BD337D0" wp14:editId="69A0BC5F">
+                <wp:simplePos x="0" y="0"/>
+                <wp:positionH relativeFrom="column">
+                  <wp:posOffset>153670</wp:posOffset>
+                </wp:positionH>
+                <wp:positionV relativeFrom="paragraph">
+                  <wp:posOffset>5473065</wp:posOffset>
+                </wp:positionV>
+                <wp:extent cx="5815330" cy="635"/>
+                <wp:effectExtent l="0" t="0" r="1270" b="0"/>
+                <wp:wrapTight wrapText="bothSides">
+                  <wp:wrapPolygon edited="0">
+                    <wp:start x="0" y="0"/>
+                    <wp:lineTo x="0" y="20571"/>
+                    <wp:lineTo x="21558" y="20571"/>
+                    <wp:lineTo x="21558" y="0"/>
+                    <wp:lineTo x="0" y="0"/>
+                  </wp:wrapPolygon>
+                </wp:wrapTight>
+                <wp:docPr id="1297539997" name="Zone de texte 1"/>
+                <wp:cNvGraphicFramePr/>
+                <a:graphic xmlns:a="http://schemas.openxmlformats.org/drawingml/2006/main">
+                  <a:graphicData uri="http://schemas.microsoft.com/office/word/2010/wordprocessingShape">
+                    <wps:wsp>
+                      <wps:cNvSpPr txBox="1"/>
+                      <wps:spPr>
+                        <a:xfrm>
+                          <a:off x="0" y="0"/>
+                          <a:ext cx="5815330" cy="635"/>
+                        </a:xfrm>
+                        <a:prstGeom prst="rect">
+                          <a:avLst/>
+                        </a:prstGeom>
+                        <a:noFill/>
+                        <a:ln>
+                          <a:noFill/>
+                        </a:ln>
+                      </wps:spPr>
+                      <wps:txbx>
+                        <w:txbxContent>
+                          <w:p>
+                            <w:pPr>
+                              <w:pStyle w:val="Lgende"/>
+                              <w:jc w:val="center"/>
+                              <w:rPr>
+                                <w:rFonts w:ascii="Arial" w:hAnsi="Arial" w:cs="Arial"/>
+                                <w:noProof/>
+                                <w:color w:val="FFFFFF" w:themeColor="background1"/>
+                                <w:sz w:val="24"/>
+                                <w:szCs w:val="24"/>
+                                <w:u w:val="single"/>
+                                <w14:textFill>
+                                  <w14:noFill/>
+                                </w14:textFill>
+                              </w:rPr>
+                            </w:pPr>
+                            <w:r>
+                              <w:rPr>
+                                <w:rFonts w:ascii="Arial" w:hAnsi="Arial" w:cs="Arial"/>
+                                <w:sz w:val="24"/>
+                                <w:szCs w:val="24"/>
+                              </w:rPr>
+                              <w:t xml:space="preserve">Figure </w:t>
+                            </w:r>
+                            <w:r>
+                              <w:rPr>
+                                <w:rFonts w:ascii="Arial" w:hAnsi="Arial" w:cs="Arial"/>
+                                <w:sz w:val="24"/>
+                                <w:szCs w:val="24"/>
+                              </w:rPr>
+                              <w:fldChar w:fldCharType="begin"/>
+                            </w:r>
+                            <w:r>
+                              <w:rPr>
+                                <w:rFonts w:ascii="Arial" w:hAnsi="Arial" w:cs="Arial"/>
+                                <w:sz w:val="24"/>
+                                <w:szCs w:val="24"/>
+                              </w:rPr>
+                              <w:instrText xml:space="preserve"> SEQ Figure \* ARABIC </w:instrText>
+                            </w:r>
+                            <w:r>
+                              <w:rPr>
+                                <w:rFonts w:ascii="Arial" w:hAnsi="Arial" w:cs="Arial"/>
+                                <w:sz w:val="24"/>
+                                <w:szCs w:val="24"/>
+                              </w:rPr>
+                              <w:fldChar w:fldCharType="separate"/>
+                            </w:r>
+                            <w:r>
+                              <w:rPr>
+                                <w:rFonts w:ascii="Arial" w:hAnsi="Arial" w:cs="Arial"/>
+                                <w:noProof/>
+                                <w:sz w:val="24"/>
+                                <w:szCs w:val="24"/>
+                              </w:rPr>
+                              <w:t>6</w:t>
+                            </w:r>
+                            <w:r>
+                              <w:rPr>
+                                <w:rFonts w:ascii="Arial" w:hAnsi="Arial" w:cs="Arial"/>
+                                <w:sz w:val="24"/>
+                                <w:szCs w:val="24"/>
+                              </w:rPr>
+                              <w:fldChar w:fldCharType="end"/>
+                            </w:r>
+                            <w:r>
+                              <w:rPr>
+                                <w:rFonts w:ascii="Arial" w:hAnsi="Arial" w:cs="Arial"/>
+                                <w:sz w:val="24"/>
+                                <w:szCs w:val="24"/>
+                              </w:rPr>
+                              <w:t xml:space="preserve"> : Schéma des API transcription-service</w:t>
+                            </w:r>
+                          </w:p>
+                        </w:txbxContent>
+                      </wps:txbx>
+                      <wps:bodyPr rot="0" spcFirstLastPara="0" vertOverflow="overflow" horzOverflow="overflow" vert="horz" wrap="square" lIns="0" tIns="0" rIns="0" bIns="0" numCol="1" spcCol="0" rtlCol="0" fromWordArt="0" anchor="t" anchorCtr="0" forceAA="0" compatLnSpc="1">
+                        <a:prstTxWarp prst="textNoShape">
+                          <a:avLst/>
+                        </a:prstTxWarp>
+                        <a:spAutoFit/>
+                      </wps:bodyPr>
+                    </wps:wsp>
+                  </a:graphicData>
+                </a:graphic>
+              </wp:anchor>
+            </w:drawing>
+          </mc:Choice>
+          <mc:Fallback>
+            <w:pict>
+              <v:shape w14:anchorId="4BD337D0" id="_x0000_s1028" type="#_x0000_t202" style="position:absolute;left:0;text-align:left;margin-left:12.1pt;margin-top:430.95pt;width:457.9pt;height:.05pt;z-index:-251649024;visibility:visible;mso-wrap-style:square;mso-wrap-distance-left:9pt;mso-wrap-distance-top:0;mso-wrap-distance-right:9pt;mso-wrap-distance-bottom:0;mso-position-horizontal:absolute;mso-position-horizontal-relative:text;mso-position-vertical:absolute;mso-position-vertical-relative:text;v-text-anchor:top" o:gfxdata="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" filled="f" stroked="f">
+                <v:textbox style="mso-fit-shape-to-text:t" inset="0,0,0,0">
+                  <w:txbxContent>
+                    <w:p>
+                      <w:pPr>
+                        <w:pStyle w:val="Lgende"/>
+                        <w:jc w:val="center"/>
+                        <w:rPr>
+                          <w:rFonts w:ascii="Arial" w:hAnsi="Arial" w:cs="Arial"/>
+                          <w:noProof/>
+                          <w:color w:val="FFFFFF" w:themeColor="background1"/>
+                          <w:sz w:val="24"/>
+                          <w:szCs w:val="24"/>
+                          <w:u w:val="single"/>
+                          <w14:textFill>
+                            <w14:noFill/>
+                          </w14:textFill>
+                        </w:rPr>
+                      </w:pPr>
+                      <w:r>
+                        <w:rPr>
+                          <w:rFonts w:ascii="Arial" w:hAnsi="Arial" w:cs="Arial"/>
+                          <w:sz w:val="24"/>
+                          <w:szCs w:val="24"/>
+                        </w:rPr>
+                        <w:t xml:space="preserve">Figure </w:t>
+                      </w:r>
+                      <w:r>
+                        <w:rPr>
+                          <w:rFonts w:ascii="Arial" w:hAnsi="Arial" w:cs="Arial"/>
+                          <w:sz w:val="24"/>
+                          <w:szCs w:val="24"/>
+                        </w:rPr>
+                        <w:fldChar w:fldCharType="begin"/>
+                      </w:r>
+                      <w:r>
+                        <w:rPr>
+                          <w:rFonts w:ascii="Arial" w:hAnsi="Arial" w:cs="Arial"/>
+                          <w:sz w:val="24"/>
+                          <w:szCs w:val="24"/>
+                        </w:rPr>
+                        <w:instrText xml:space="preserve"> SEQ Figure \* ARABIC </w:instrText>
+                      </w:r>
+                      <w:r>
+                        <w:rPr>
+                          <w:rFonts w:ascii="Arial" w:hAnsi="Arial" w:cs="Arial"/>
+                          <w:sz w:val="24"/>
+                          <w:szCs w:val="24"/>
+                        </w:rPr>
+                        <w:fldChar w:fldCharType="separate"/>
+                      </w:r>
+                      <w:r>
+                        <w:rPr>
+                          <w:rFonts w:ascii="Arial" w:hAnsi="Arial" w:cs="Arial"/>
+                          <w:noProof/>
+                          <w:sz w:val="24"/>
+                          <w:szCs w:val="24"/>
+                        </w:rPr>
+                        <w:t>6</w:t>
+                      </w:r>
+                      <w:r>
+                        <w:rPr>
+                          <w:rFonts w:ascii="Arial" w:hAnsi="Arial" w:cs="Arial"/>
+                          <w:sz w:val="24"/>
+                          <w:szCs w:val="24"/>
+                        </w:rPr>
+                        <w:fldChar w:fldCharType="end"/>
+                      </w:r>
+                      <w:r>
+                        <w:rPr>
+                          <w:rFonts w:ascii="Arial" w:hAnsi="Arial" w:cs="Arial"/>
+                          <w:sz w:val="24"/>
+                          <w:szCs w:val="24"/>
+                        </w:rPr>
+                        <w:t xml:space="preserve"> : Schéma des API transcription-service</w:t>
+                      </w:r>
+                    </w:p>
+                  </w:txbxContent>
+                </v:textbox>
+                <w10:wrap type="tight"/>
+              </v:shape>
+            </w:pict>
+          </mc:Fallback>
+        </mc:AlternateContent>
+      </w:r>
       <w:r>
         <w:rPr>
           <w:noProof/>
@@ -957,7 +1788,7 @@
                     <pic:cNvPicPr/>
                   </pic:nvPicPr>
                   <pic:blipFill>
-                    <a:blip r:embed="rId8">
+                    <a:blip r:embed="rId12">
                       <a:extLst>
                         <a:ext uri="{28A0092B-C50C-407E-A947-70E740481C1C}">
                           <a14:useLocalDpi xmlns:a14="http://schemas.microsoft.com/office/drawing/2010/main" val="0"/>
@@ -1012,6 +1843,11 @@
     <w:p/>
     <w:p/>
     <w:p/>
+    <w:p>
+      <w:r>
+        <w:br w:type="page"/>
+      </w:r>
+    </w:p>
     <w:p/>
     <w:p>
       <w:pPr>
@@ -1022,8 +1858,126 @@
         </w:numPr>
       </w:pPr>
       <w:r>
-        <w:lastRenderedPageBreak/>
         <w:t>Diagramme de déploiement</w:t>
+      </w:r>
+    </w:p>
+    <w:p>
+      <w:pPr>
+        <w:keepNext/>
+      </w:pPr>
+      <w:r>
+        <w:rPr>
+          <w:noProof/>
+        </w:rPr>
+        <w:drawing>
+          <wp:inline distT="0" distB="0" distL="0" distR="0" wp14:anchorId="7E61A783" wp14:editId="3AE47F36">
+            <wp:extent cx="5760720" cy="4382135"/>
+            <wp:effectExtent l="0" t="0" r="5080" b="0"/>
+            <wp:docPr id="661238139" name="Image 6" descr="Une image contenant texte, diagramme, capture d’écran, ligne&#10;&#10;Le contenu généré par l’IA peut être incorrect."/>
+            <wp:cNvGraphicFramePr>
+              <a:graphicFrameLocks xmlns:a="http://schemas.openxmlformats.org/drawingml/2006/main" noChangeAspect="1"/>
+            </wp:cNvGraphicFramePr>
+            <a:graphic xmlns:a="http://schemas.openxmlformats.org/drawingml/2006/main">
+              <a:graphicData uri="http://schemas.openxmlformats.org/drawingml/2006/picture">
+                <pic:pic xmlns:pic="http://schemas.openxmlformats.org/drawingml/2006/picture">
+                  <pic:nvPicPr>
+                    <pic:cNvPr id="661238139" name="Image 6" descr="Une image contenant texte, diagramme, capture d’écran, ligne&#10;&#10;Le contenu généré par l’IA peut être incorrect."/>
+                    <pic:cNvPicPr/>
+                  </pic:nvPicPr>
+                  <pic:blipFill>
+                    <a:blip r:embed="rId13" cstate="print">
+                      <a:extLst>
+                        <a:ext uri="{28A0092B-C50C-407E-A947-70E740481C1C}">
+                          <a14:useLocalDpi xmlns:a14="http://schemas.microsoft.com/office/drawing/2010/main" val="0"/>
+                        </a:ext>
+                      </a:extLst>
+                    </a:blip>
+                    <a:stretch>
+                      <a:fillRect/>
+                    </a:stretch>
+                  </pic:blipFill>
+                  <pic:spPr>
+                    <a:xfrm>
+                      <a:off x="0" y="0"/>
+                      <a:ext cx="5760720" cy="4382135"/>
+                    </a:xfrm>
+                    <a:prstGeom prst="rect">
+                      <a:avLst/>
+                    </a:prstGeom>
+                  </pic:spPr>
+                </pic:pic>
+              </a:graphicData>
+            </a:graphic>
+          </wp:inline>
+        </w:drawing>
+      </w:r>
+    </w:p>
+    <w:p>
+      <w:pPr>
+        <w:pStyle w:val="Lgende"/>
+        <w:jc w:val="center"/>
+        <w:rPr>
+          <w:rFonts w:ascii="Arial" w:hAnsi="Arial" w:cs="Arial"/>
+          <w:sz w:val="24"/>
+          <w:szCs w:val="24"/>
+        </w:rPr>
+      </w:pPr>
+      <w:r>
+        <w:rPr>
+          <w:rFonts w:ascii="Arial" w:hAnsi="Arial" w:cs="Arial"/>
+          <w:sz w:val="24"/>
+          <w:szCs w:val="24"/>
+        </w:rPr>
+        <w:t xml:space="preserve">Figure </w:t>
+      </w:r>
+      <w:r>
+        <w:rPr>
+          <w:rFonts w:ascii="Arial" w:hAnsi="Arial" w:cs="Arial"/>
+          <w:sz w:val="24"/>
+          <w:szCs w:val="24"/>
+        </w:rPr>
+        <w:fldChar w:fldCharType="begin"/>
+      </w:r>
+      <w:r>
+        <w:rPr>
+          <w:rFonts w:ascii="Arial" w:hAnsi="Arial" w:cs="Arial"/>
+          <w:sz w:val="24"/>
+          <w:szCs w:val="24"/>
+        </w:rPr>
+        <w:instrText xml:space="preserve"> SEQ Figure \* ARABIC </w:instrText>
+      </w:r>
+      <w:r>
+        <w:rPr>
+          <w:rFonts w:ascii="Arial" w:hAnsi="Arial" w:cs="Arial"/>
+          <w:sz w:val="24"/>
+          <w:szCs w:val="24"/>
+        </w:rPr>
+        <w:fldChar w:fldCharType="separate"/>
+      </w:r>
+      <w:r>
+        <w:rPr>
+          <w:rFonts w:ascii="Arial" w:hAnsi="Arial" w:cs="Arial"/>
+          <w:noProof/>
+          <w:sz w:val="24"/>
+          <w:szCs w:val="24"/>
+        </w:rPr>
+        <w:t>7</w:t>
+      </w:r>
+      <w:r>
+        <w:rPr>
+          <w:rFonts w:ascii="Arial" w:hAnsi="Arial" w:cs="Arial"/>
+          <w:sz w:val="24"/>
+          <w:szCs w:val="24"/>
+        </w:rPr>
+        <w:fldChar w:fldCharType="end"/>
+      </w:r>
+      <w:r>
+        <w:rPr>
+          <w:rFonts w:ascii="Arial" w:hAnsi="Arial" w:cs="Arial"/>
+          <w:sz w:val="24"/>
+          <w:szCs w:val="24"/>
+        </w:rPr>
+        <w:t xml:space="preserve"> : Diagramme de déploiement</w:t>
       </w:r>
     </w:p>
     <w:p/>
@@ -1045,6 +1999,218 @@
           <w:noProof/>
         </w:rPr>
         <w:lastRenderedPageBreak/>
+        <mc:AlternateContent>
+          <mc:Choice Requires="wps">
+            <w:drawing>
+              <wp:anchor distT="0" distB="0" distL="114300" distR="114300" simplePos="0" relativeHeight="251669504" behindDoc="1" locked="0" layoutInCell="1" allowOverlap="1" wp14:anchorId="6EAC60A7" wp14:editId="0723C54A">
+                <wp:simplePos x="0" y="0"/>
+                <wp:positionH relativeFrom="column">
+                  <wp:posOffset>-372745</wp:posOffset>
+                </wp:positionH>
+                <wp:positionV relativeFrom="paragraph">
+                  <wp:posOffset>4911725</wp:posOffset>
+                </wp:positionV>
+                <wp:extent cx="6707505" cy="635"/>
+                <wp:effectExtent l="0" t="0" r="10795" b="0"/>
+                <wp:wrapTight wrapText="bothSides">
+                  <wp:wrapPolygon edited="0">
+                    <wp:start x="0" y="0"/>
+                    <wp:lineTo x="0" y="20571"/>
+                    <wp:lineTo x="21594" y="20571"/>
+                    <wp:lineTo x="21594" y="0"/>
+                    <wp:lineTo x="0" y="0"/>
+                  </wp:wrapPolygon>
+                </wp:wrapTight>
+                <wp:docPr id="379881532" name="Zone de texte 1"/>
+                <wp:cNvGraphicFramePr/>
+                <a:graphic xmlns:a="http://schemas.openxmlformats.org/drawingml/2006/main">
+                  <a:graphicData uri="http://schemas.microsoft.com/office/word/2010/wordprocessingShape">
+                    <wps:wsp>
+                      <wps:cNvSpPr txBox="1"/>
+                      <wps:spPr>
+                        <a:xfrm>
+                          <a:off x="0" y="0"/>
+                          <a:ext cx="6707505" cy="635"/>
+                        </a:xfrm>
+                        <a:prstGeom prst="rect">
+                          <a:avLst/>
+                        </a:prstGeom>
+                        <a:noFill/>
+                        <a:ln>
+                          <a:noFill/>
+                        </a:ln>
+                      </wps:spPr>
+                      <wps:txbx>
+                        <w:txbxContent>
+                          <w:p>
+                            <w:pPr>
+                              <w:pStyle w:val="Lgende"/>
+                              <w:jc w:val="center"/>
+                              <w:rPr>
+                                <w:rFonts w:ascii="Arial" w:hAnsi="Arial" w:cs="Arial"/>
+                                <w:noProof/>
+                                <w:sz w:val="24"/>
+                                <w:szCs w:val="24"/>
+                              </w:rPr>
+                            </w:pPr>
+                            <w:r>
+                              <w:rPr>
+                                <w:rFonts w:ascii="Arial" w:hAnsi="Arial" w:cs="Arial"/>
+                                <w:sz w:val="24"/>
+                                <w:szCs w:val="24"/>
+                              </w:rPr>
+                              <w:t xml:space="preserve">Figure </w:t>
+                            </w:r>
+                            <w:r>
+                              <w:rPr>
+                                <w:rFonts w:ascii="Arial" w:hAnsi="Arial" w:cs="Arial"/>
+                                <w:sz w:val="24"/>
+                                <w:szCs w:val="24"/>
+                              </w:rPr>
+                              <w:fldChar w:fldCharType="begin"/>
+                            </w:r>
+                            <w:r>
+                              <w:rPr>
+                                <w:rFonts w:ascii="Arial" w:hAnsi="Arial" w:cs="Arial"/>
+                                <w:sz w:val="24"/>
+                                <w:szCs w:val="24"/>
+                              </w:rPr>
+                              <w:instrText xml:space="preserve"> SEQ Figure \* ARABIC </w:instrText>
+                            </w:r>
+                            <w:r>
+                              <w:rPr>
+                                <w:rFonts w:ascii="Arial" w:hAnsi="Arial" w:cs="Arial"/>
+                                <w:sz w:val="24"/>
+                                <w:szCs w:val="24"/>
+                              </w:rPr>
+                              <w:fldChar w:fldCharType="separate"/>
+                            </w:r>
+                            <w:r>
+                              <w:rPr>
+                                <w:rFonts w:ascii="Arial" w:hAnsi="Arial" w:cs="Arial"/>
+                                <w:noProof/>
+                                <w:sz w:val="24"/>
+                                <w:szCs w:val="24"/>
+                              </w:rPr>
+                              <w:t>8</w:t>
+                            </w:r>
+                            <w:r>
+                              <w:rPr>
+                                <w:rFonts w:ascii="Arial" w:hAnsi="Arial" w:cs="Arial"/>
+                                <w:sz w:val="24"/>
+                                <w:szCs w:val="24"/>
+                              </w:rPr>
+                              <w:fldChar w:fldCharType="end"/>
+                            </w:r>
+                            <w:r>
+                              <w:rPr>
+                                <w:rFonts w:ascii="Arial" w:hAnsi="Arial" w:cs="Arial"/>
+                                <w:sz w:val="24"/>
+                                <w:szCs w:val="24"/>
+                              </w:rPr>
+                              <w:t xml:space="preserve"> : MCD</w:t>
+                            </w:r>
+                          </w:p>
+                        </w:txbxContent>
+                      </wps:txbx>
+                      <wps:bodyPr rot="0" spcFirstLastPara="0" vertOverflow="overflow" horzOverflow="overflow" vert="horz" wrap="square" lIns="0" tIns="0" rIns="0" bIns="0" numCol="1" spcCol="0" rtlCol="0" fromWordArt="0" anchor="t" anchorCtr="0" forceAA="0" compatLnSpc="1">
+                        <a:prstTxWarp prst="textNoShape">
+                          <a:avLst/>
+                        </a:prstTxWarp>
+                        <a:spAutoFit/>
+                      </wps:bodyPr>
+                    </wps:wsp>
+                  </a:graphicData>
+                </a:graphic>
+              </wp:anchor>
+            </w:drawing>
+          </mc:Choice>
+          <mc:Fallback>
+            <w:pict>
+              <v:shape w14:anchorId="6EAC60A7" id="_x0000_s1029" type="#_x0000_t202" style="position:absolute;left:0;text-align:left;margin-left:-29.35pt;margin-top:386.75pt;width:528.15pt;height:.05pt;z-index:-251646976;visibility:visible;mso-wrap-style:square;mso-wrap-distance-left:9pt;mso-wrap-distance-top:0;mso-wrap-distance-right:9pt;mso-wrap-distance-bottom:0;mso-position-horizontal:absolute;mso-position-horizontal-relative:text;mso-position-vertical:absolute;mso-position-vertical-relative:text;v-text-anchor:top" o:gfxdata="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" filled="f" stroked="f">
+                <v:textbox style="mso-fit-shape-to-text:t" inset="0,0,0,0">
+                  <w:txbxContent>
+                    <w:p>
+                      <w:pPr>
+                        <w:pStyle w:val="Lgende"/>
+                        <w:jc w:val="center"/>
+                        <w:rPr>
+                          <w:rFonts w:ascii="Arial" w:hAnsi="Arial" w:cs="Arial"/>
+                          <w:noProof/>
+                          <w:sz w:val="24"/>
+                          <w:szCs w:val="24"/>
+                        </w:rPr>
+                      </w:pPr>
+                      <w:r>
+                        <w:rPr>
+                          <w:rFonts w:ascii="Arial" w:hAnsi="Arial" w:cs="Arial"/>
+                          <w:sz w:val="24"/>
+                          <w:szCs w:val="24"/>
+                        </w:rPr>
+                        <w:t xml:space="preserve">Figure </w:t>
+                      </w:r>
+                      <w:r>
+                        <w:rPr>
+                          <w:rFonts w:ascii="Arial" w:hAnsi="Arial" w:cs="Arial"/>
+                          <w:sz w:val="24"/>
+                          <w:szCs w:val="24"/>
+                        </w:rPr>
+                        <w:fldChar w:fldCharType="begin"/>
+                      </w:r>
+                      <w:r>
+                        <w:rPr>
+                          <w:rFonts w:ascii="Arial" w:hAnsi="Arial" w:cs="Arial"/>
+                          <w:sz w:val="24"/>
+                          <w:szCs w:val="24"/>
+                        </w:rPr>
+                        <w:instrText xml:space="preserve"> SEQ Figure \* ARABIC </w:instrText>
+                      </w:r>
+                      <w:r>
+                        <w:rPr>
+                          <w:rFonts w:ascii="Arial" w:hAnsi="Arial" w:cs="Arial"/>
+                          <w:sz w:val="24"/>
+                          <w:szCs w:val="24"/>
+                        </w:rPr>
+                        <w:fldChar w:fldCharType="separate"/>
+                      </w:r>
+                      <w:r>
+                        <w:rPr>
+                          <w:rFonts w:ascii="Arial" w:hAnsi="Arial" w:cs="Arial"/>
+                          <w:noProof/>
+                          <w:sz w:val="24"/>
+                          <w:szCs w:val="24"/>
+                        </w:rPr>
+                        <w:t>8</w:t>
+                      </w:r>
+                      <w:r>
+                        <w:rPr>
+                          <w:rFonts w:ascii="Arial" w:hAnsi="Arial" w:cs="Arial"/>
+                          <w:sz w:val="24"/>
+                          <w:szCs w:val="24"/>
+                        </w:rPr>
+                        <w:fldChar w:fldCharType="end"/>
+                      </w:r>
+                      <w:r>
+                        <w:rPr>
+                          <w:rFonts w:ascii="Arial" w:hAnsi="Arial" w:cs="Arial"/>
+                          <w:sz w:val="24"/>
+                          <w:szCs w:val="24"/>
+                        </w:rPr>
+                        <w:t xml:space="preserve"> : MCD</w:t>
+                      </w:r>
+                    </w:p>
+                  </w:txbxContent>
+                </v:textbox>
+                <w10:wrap type="tight"/>
+              </v:shape>
+            </w:pict>
+          </mc:Fallback>
+        </mc:AlternateContent>
+      </w:r>
+      <w:r>
+        <w:rPr>
+          <w:noProof/>
+        </w:rPr>
         <w:drawing>
           <wp:anchor distT="0" distB="0" distL="114300" distR="114300" simplePos="0" relativeHeight="251665408" behindDoc="1" locked="0" layoutInCell="1" allowOverlap="1" wp14:anchorId="11AA9CF4" wp14:editId="65A6D579">
             <wp:simplePos x="0" y="0"/>
@@ -1077,7 +2243,7 @@
                     <pic:cNvPicPr/>
                   </pic:nvPicPr>
                   <pic:blipFill>
-                    <a:blip r:embed="rId9">
+                    <a:blip r:embed="rId14">
                       <a:extLst>
                         <a:ext uri="{28A0092B-C50C-407E-A947-70E740481C1C}">
                           <a14:useLocalDpi xmlns:a14="http://schemas.microsoft.com/office/drawing/2010/main" val="0"/>
@@ -1134,6 +2300,56 @@
     </w:sectPr>
   </w:body>
 </w:document>
+</file>
+
+<file path=word/endnotes.xml><?xml version="1.0" encoding="utf-8"?>
+<w:endnotes xmlns:wpc="http://schemas.microsoft.com/office/word/2010/wordprocessingCanvas" xmlns:cx="http://schemas.microsoft.com/office/drawing/2014/chartex" xmlns:cx1="http://schemas.microsoft.com/office/drawing/2015/9/8/chartex" xmlns:cx2="http://schemas.microsoft.com/office/drawing/2015/10/21/chartex" xmlns:cx3="http://schemas.microsoft.com/office/drawing/2016/5/9/chartex" xmlns:cx4="http://schemas.microsoft.com/office/drawing/2016/5/10/chartex" xmlns:cx5="http://schemas.microsoft.com/office/drawing/2016/5/11/chartex" xmlns:cx6="http://schemas.microsoft.com/office/drawing/2016/5/12/chartex" xmlns:cx7="http://schemas.microsoft.com/office/drawing/2016/5/13/chartex" xmlns:cx8="http://schemas.microsoft.com/office/drawing/2016/5/14/chartex" xmlns:mc="http://schemas.openxmlformats.org/markup-compatibility/2006" xmlns:aink="http://schemas.microsoft.com/office/drawing/2016/ink" xmlns:am3d="http://schemas.microsoft.com/office/drawing/2017/model3d" xmlns:o="urn:schemas-microsoft-com:office:office" xmlns:oel="http://schemas.microsoft.com/office/2019/extlst" xmlns:r="http://schemas.openxmlformats.org/officeDocument/2006/relationships" xmlns:m="http://schemas.openxmlformats.org/officeDocument/2006/math" xmlns:v="urn:schemas-microsoft-com:vml" xmlns:wp14="http://schemas.microsoft.com/office/word/2010/wordprocessingDrawing" xmlns:wp="http://schemas.openxmlformats.org/drawingml/2006/wordprocessingDrawing" xmlns:w10="urn:schemas-microsoft-com:office:word" xmlns:w="http://schemas.openxmlformats.org/wordprocessingml/2006/main" xmlns:w14="http://schemas.microsoft.com/office/word/2010/wordml" xmlns:w15="http://schemas.microsoft.com/office/word/2012/wordml" xmlns:w16cex="http://schemas.microsoft.com/office/word/2018/wordml/cex" xmlns:w16cid="http://schemas.microsoft.com/office/word/2016/wordml/cid" xmlns:w16="http://schemas.microsoft.com/office/word/2018/wordml" xmlns:w16du="http://schemas.microsoft.com/office/word/2023/wordml/word16du" xmlns:w16sdtdh="http://schemas.microsoft.com/office/word/2020/wordml/sdtdatahash" xmlns:w16sdtfl="http://schemas.microsoft.com/office/word/2024/wordml/sdtformatlock" xmlns:w16se="http://schemas.microsoft.com/office/word/2015/wordml/symex" xmlns:wpg="http://schemas.microsoft.com/office/word/2010/wordprocessingGroup" xmlns:wpi="http://schemas.microsoft.com/office/word/2010/wordprocessingInk" xmlns:wne="http://schemas.microsoft.com/office/word/2006/wordml" xmlns:wps="http://schemas.microsoft.com/office/word/2010/wordprocessingShape" mc:Ignorable="w14 w15 w16se w16cid w16 w16cex w16sdtdh w16sdtfl w16du wp14">
+  <w:endnote w:type="separator" w:id="-1">
+    <w:p>
+      <w:pPr>
+        <w:spacing w:after="0" w:line="240" w:lineRule="auto"/>
+      </w:pPr>
+      <w:r>
+        <w:separator/>
+      </w:r>
+    </w:p>
+  </w:endnote>
+  <w:endnote w:type="continuationSeparator" w:id="0">
+    <w:p>
+      <w:pPr>
+        <w:spacing w:after="0" w:line="240" w:lineRule="auto"/>
+      </w:pPr>
+      <w:r>
+        <w:continuationSeparator/>
+      </w:r>
+    </w:p>
+  </w:endnote>
+</w:endnotes>
+</file>
+
+<file path=word/footnotes.xml><?xml version="1.0" encoding="utf-8"?>
+<w:footnotes xmlns:wpc="http://schemas.microsoft.com/office/word/2010/wordprocessingCanvas" xmlns:cx="http://schemas.microsoft.com/office/drawing/2014/chartex" xmlns:cx1="http://schemas.microsoft.com/office/drawing/2015/9/8/chartex" xmlns:cx2="http://schemas.microsoft.com/office/drawing/2015/10/21/chartex" xmlns:cx3="http://schemas.microsoft.com/office/drawing/2016/5/9/chartex" xmlns:cx4="http://schemas.microsoft.com/office/drawing/2016/5/10/chartex" xmlns:cx5="http://schemas.microsoft.com/office/drawing/2016/5/11/chartex" xmlns:cx6="http://schemas.microsoft.com/office/drawing/2016/5/12/chartex" xmlns:cx7="http://schemas.microsoft.com/office/drawing/2016/5/13/chartex" xmlns:cx8="http://schemas.microsoft.com/office/drawing/2016/5/14/chartex" xmlns:mc="http://schemas.openxmlformats.org/markup-compatibility/2006" xmlns:aink="http://schemas.microsoft.com/office/drawing/2016/ink" xmlns:am3d="http://schemas.microsoft.com/office/drawing/2017/model3d" xmlns:o="urn:schemas-microsoft-com:office:office" xmlns:oel="http://schemas.microsoft.com/office/2019/extlst" xmlns:r="http://schemas.openxmlformats.org/officeDocument/2006/relationships" xmlns:m="http://schemas.openxmlformats.org/officeDocument/2006/math" xmlns:v="urn:schemas-microsoft-com:vml" xmlns:wp14="http://schemas.microsoft.com/office/word/2010/wordprocessingDrawing" xmlns:wp="http://schemas.openxmlformats.org/drawingml/2006/wordprocessingDrawing" xmlns:w10="urn:schemas-microsoft-com:office:word" xmlns:w="http://schemas.openxmlformats.org/wordprocessingml/2006/main" xmlns:w14="http://schemas.microsoft.com/office/word/2010/wordml" xmlns:w15="http://schemas.microsoft.com/office/word/2012/wordml" xmlns:w16cex="http://schemas.microsoft.com/office/word/2018/wordml/cex" xmlns:w16cid="http://schemas.microsoft.com/office/word/2016/wordml/cid" xmlns:w16="http://schemas.microsoft.com/office/word/2018/wordml" xmlns:w16du="http://schemas.microsoft.com/office/word/2023/wordml/word16du" xmlns:w16sdtdh="http://schemas.microsoft.com/office/word/2020/wordml/sdtdatahash" xmlns:w16sdtfl="http://schemas.microsoft.com/office/word/2024/wordml/sdtformatlock" xmlns:w16se="http://schemas.microsoft.com/office/word/2015/wordml/symex" xmlns:wpg="http://schemas.microsoft.com/office/word/2010/wordprocessingGroup" xmlns:wpi="http://schemas.microsoft.com/office/word/2010/wordprocessingInk" xmlns:wne="http://schemas.microsoft.com/office/word/2006/wordml" xmlns:wps="http://schemas.microsoft.com/office/word/2010/wordprocessingShape" mc:Ignorable="w14 w15 w16se w16cid w16 w16cex w16sdtdh w16sdtfl w16du wp14">
+  <w:footnote w:type="separator" w:id="-1">
+    <w:p>
+      <w:pPr>
+        <w:spacing w:after="0" w:line="240" w:lineRule="auto"/>
+      </w:pPr>
+      <w:r>
+        <w:separator/>
+      </w:r>
+    </w:p>
+  </w:footnote>
+  <w:footnote w:type="continuationSeparator" w:id="0">
+    <w:p>
+      <w:pPr>
+        <w:spacing w:after="0" w:line="240" w:lineRule="auto"/>
+      </w:pPr>
+      <w:r>
+        <w:continuationSeparator/>
+      </w:r>
+    </w:p>
+  </w:footnote>
+</w:footnotes>
 </file>
 
 <file path=word/numbering.xml><?xml version="1.0" encoding="utf-8"?>
@@ -2255,6 +3471,50 @@
       <w:szCs w:val="18"/>
     </w:rPr>
   </w:style>
+  <w:style w:type="paragraph" w:styleId="En-tte">
+    <w:name w:val="header"/>
+    <w:basedOn w:val="Normal"/>
+    <w:link w:val="En-tteCar"/>
+    <w:uiPriority w:val="99"/>
+    <w:unhideWhenUsed/>
+    <w:rsid w:val="00AF4441"/>
+    <w:pPr>
+      <w:tabs>
+        <w:tab w:val="center" w:pos="4536"/>
+        <w:tab w:val="right" w:pos="9072"/>
+      </w:tabs>
+      <w:spacing w:after="0" w:line="240" w:lineRule="auto"/>
+    </w:pPr>
+  </w:style>
+  <w:style w:type="character" w:customStyle="1" w:styleId="En-tteCar">
+    <w:name w:val="En-tête Car"/>
+    <w:basedOn w:val="Policepardfaut"/>
+    <w:link w:val="En-tte"/>
+    <w:uiPriority w:val="99"/>
+    <w:rsid w:val="00AF4441"/>
+  </w:style>
+  <w:style w:type="paragraph" w:styleId="Pieddepage">
+    <w:name w:val="footer"/>
+    <w:basedOn w:val="Normal"/>
+    <w:link w:val="PieddepageCar"/>
+    <w:uiPriority w:val="99"/>
+    <w:unhideWhenUsed/>
+    <w:rsid w:val="00AF4441"/>
+    <w:pPr>
+      <w:tabs>
+        <w:tab w:val="center" w:pos="4536"/>
+        <w:tab w:val="right" w:pos="9072"/>
+      </w:tabs>
+      <w:spacing w:after="0" w:line="240" w:lineRule="auto"/>
+    </w:pPr>
+  </w:style>
+  <w:style w:type="character" w:customStyle="1" w:styleId="PieddepageCar">
+    <w:name w:val="Pied de page Car"/>
+    <w:basedOn w:val="Policepardfaut"/>
+    <w:link w:val="Pieddepage"/>
+    <w:uiPriority w:val="99"/>
+    <w:rsid w:val="00AF4441"/>
+  </w:style>
 </w:styles>
 </file>
 

</xml_diff>